<commit_message>
Standalone single-country tool (CountryTool v0.1)
MacroFiscalModels/CountryTool/MacroFiscal_CountryTool_v0.1.xlsx: pick a country and see the
integrated chain (investment need, feasible carbon pricing and its limits, GDP and debt paths,
LIC-DSF-lite rating, data-or-default settings) with four charts; no Python needed. Built by
build_country_tool.py from integrated.py --all, which now also writes annual paths and
calibration settings. Versioned, with README, VersionNotes and Archive.

Co-Authored-By: Claude Opus 5.5 <noreply@anthropic.com>
Claude-Session: https://claude.ai/code/session_012ycgCvLtGNELqWAvcBTHbw
</commit_message>
<xml_diff>
--- a/MacroFiscalModels/Docs/UserGuide_4_Integrated.docx
+++ b/MacroFiscalModels/Docs/UserGuide_4_Integrated.docx
@@ -495,7 +495,86 @@
       </w:r>
     </w:p>
     <w:bookmarkEnd w:id="21"/>
-    <w:bookmarkStart w:id="22" w:name="which-model-a-country-gets"/>
+    <w:bookmarkStart w:id="22" w:name="the-country-tool"/>
+    <w:p>
+      <w:pPr>
+        <w:pStyle w:val="Heading1"/>
+      </w:pPr>
+      <w:r>
+        <w:t xml:space="preserve">The country tool</w:t>
+      </w:r>
+    </w:p>
+    <w:p>
+      <w:pPr>
+        <w:pStyle w:val="FirstParagraph"/>
+      </w:pPr>
+      <w:r>
+        <w:rPr>
+          <w:rStyle w:val="VerbatimChar"/>
+        </w:rPr>
+        <w:t xml:space="preserve">MacroFiscalModels/CountryTool/MacroFiscal_CountryTool_v0.1.xlsx</w:t>
+      </w:r>
+      <w:r>
+        <w:t xml:space="preserve"> </w:t>
+      </w:r>
+      <w:r>
+        <w:t xml:space="preserve">shows these results one country at a time, with charts, and needs no Python: open it, go to the</w:t>
+      </w:r>
+      <w:r>
+        <w:t xml:space="preserve"> </w:t>
+      </w:r>
+      <w:r>
+        <w:rPr>
+          <w:bCs/>
+          <w:b/>
+        </w:rPr>
+        <w:t xml:space="preserve">Country</w:t>
+      </w:r>
+      <w:r>
+        <w:t xml:space="preserve"> </w:t>
+      </w:r>
+      <w:r>
+        <w:t xml:space="preserve">sheet and pick a country in the yellow cell. After a new</w:t>
+      </w:r>
+      <w:r>
+        <w:t xml:space="preserve"> </w:t>
+      </w:r>
+      <w:r>
+        <w:rPr>
+          <w:rStyle w:val="VerbatimChar"/>
+        </w:rPr>
+        <w:t xml:space="preserve">integrated.py --all</w:t>
+      </w:r>
+      <w:r>
+        <w:t xml:space="preserve">, rebuild it with</w:t>
+      </w:r>
+      <w:r>
+        <w:t xml:space="preserve"> </w:t>
+      </w:r>
+      <w:r>
+        <w:rPr>
+          <w:rStyle w:val="VerbatimChar"/>
+        </w:rPr>
+        <w:t xml:space="preserve">python3 build_country_tool.py</w:t>
+      </w:r>
+      <w:r>
+        <w:t xml:space="preserve">. See</w:t>
+      </w:r>
+      <w:r>
+        <w:t xml:space="preserve"> </w:t>
+      </w:r>
+      <w:r>
+        <w:rPr>
+          <w:rStyle w:val="VerbatimChar"/>
+        </w:rPr>
+        <w:t xml:space="preserve">CountryTool/README.md</w:t>
+      </w:r>
+      <w:r>
+        <w:t xml:space="preserve">.</w:t>
+      </w:r>
+    </w:p>
+    <w:bookmarkEnd w:id="22"/>
+    <w:bookmarkStart w:id="23" w:name="which-model-a-country-gets"/>
     <w:p>
       <w:pPr>
         <w:pStyle w:val="Heading1"/>
@@ -672,8 +751,8 @@
         <w:t xml:space="preserve">.</w:t>
       </w:r>
     </w:p>
-    <w:bookmarkEnd w:id="22"/>
-    <w:bookmarkStart w:id="23" w:name="reading-the-output"/>
+    <w:bookmarkEnd w:id="23"/>
+    <w:bookmarkStart w:id="24" w:name="reading-the-output"/>
     <w:p>
       <w:pPr>
         <w:pStyle w:val="Heading1"/>
@@ -1282,8 +1361,8 @@
         <w:t xml:space="preserve">In the dashboard, Appendix D shows six of these: budget need, pricing revenue, financing gap, GDP and debt in 2050, and the DSF risk code. The block is labelled as model output.</w:t>
       </w:r>
     </w:p>
-    <w:bookmarkEnd w:id="23"/>
-    <w:bookmarkStart w:id="24" w:name="caveats"/>
+    <w:bookmarkEnd w:id="24"/>
+    <w:bookmarkStart w:id="25" w:name="caveats"/>
     <w:p>
       <w:pPr>
         <w:pStyle w:val="Heading1"/>
@@ -1417,7 +1496,7 @@
         <w:t xml:space="preserve">fall 80% by 2050 in DIGNAR-lite whether or not the country runs the programme: it is the global transition, not a domestic choice.</w:t>
       </w:r>
     </w:p>
-    <w:bookmarkEnd w:id="24"/>
+    <w:bookmarkEnd w:id="25"/>
     <w:sectPr>
       <w:pgSz w:h="15840" w:w="12240"/>
       <w:pgMar w:bottom="1296" w:footer="720" w:gutter="0" w:header="720" w:left="1296" w:right="1296" w:top="1296"/>

</xml_diff>